<commit_message>
Final submission: README for judges, video link, deck, disclosure
</commit_message>
<xml_diff>
--- a/submission/TIET_TapTrace_AI_Disclosure.docx
+++ b/submission/TIET_TapTrace_AI_Disclosure.docx
@@ -1,6 +1,6 @@
 
 <file path=word/document.xml><?xml version="1.0" encoding="utf-8"?>
-<w:document xmlns:wpc="http://schemas.microsoft.com/office/word/2010/wordprocessingCanvas" xmlns:cx="http://schemas.microsoft.com/office/drawing/2014/chartex" xmlns:cx1="http://schemas.microsoft.com/office/drawing/2015/9/8/chartex" xmlns:cx2="http://schemas.microsoft.com/office/drawing/2015/10/21/chartex" xmlns:cx3="http://schemas.microsoft.com/office/drawing/2016/5/9/chartex" xmlns:cx4="http://schemas.microsoft.com/office/drawing/2016/5/10/chartex" xmlns:cx5="http://schemas.microsoft.com/office/drawing/2016/5/11/chartex" xmlns:cx6="http://schemas.microsoft.com/office/drawing/2016/5/12/chartex" xmlns:cx7="http://schemas.microsoft.com/office/drawing/2016/5/13/chartex" xmlns:cx8="http://schemas.microsoft.com/office/drawing/2016/5/14/chartex" xmlns:mc="http://schemas.openxmlformats.org/markup-compatibility/2006" xmlns:aink="http://schemas.microsoft.com/office/drawing/2016/ink" xmlns:am3d="http://schemas.microsoft.com/office/drawing/2017/model3d" xmlns:o="urn:schemas-microsoft-com:office:office" xmlns:r="http://schemas.openxmlformats.org/officeDocument/2006/relationships" xmlns:m="http://schemas.openxmlformats.org/officeDocument/2006/math" xmlns:v="urn:schemas-microsoft-com:vml" xmlns:wp14="http://schemas.microsoft.com/office/word/2010/wordprocessingDrawing" xmlns:wp="http://schemas.openxmlformats.org/drawingml/2006/wordprocessingDrawing" xmlns:w10="urn:schemas-microsoft-com:office:word" xmlns:w="http://schemas.openxmlformats.org/wordprocessingml/2006/main" xmlns:w14="http://schemas.microsoft.com/office/word/2010/wordml" xmlns:w15="http://schemas.microsoft.com/office/word/2012/wordml" xmlns:w16cex="http://schemas.microsoft.com/office/word/2018/wordml/cex" xmlns:w16cid="http://schemas.microsoft.com/office/word/2016/wordml/cid" xmlns:w16="http://schemas.microsoft.com/office/word/2018/wordml" xmlns:w16sdtdh="http://schemas.microsoft.com/office/word/2020/wordml/sdtdatahash" xmlns:w16se="http://schemas.microsoft.com/office/word/2015/wordml/symex" xmlns:wpg="http://schemas.microsoft.com/office/word/2010/wordprocessingGroup" xmlns:wpi="http://schemas.microsoft.com/office/word/2010/wordprocessingInk" xmlns:wne="http://schemas.microsoft.com/office/word/2006/wordml" xmlns:wps="http://schemas.microsoft.com/office/word/2010/wordprocessingShape" mc:Ignorable="w14 w15 w16se w16cid w16 w16cex w16sdtdh wp14">
+<w:document xmlns:wpc="http://schemas.microsoft.com/office/word/2010/wordprocessingCanvas" xmlns:cx="http://schemas.microsoft.com/office/drawing/2014/chartex" xmlns:cx1="http://schemas.microsoft.com/office/drawing/2015/9/8/chartex" xmlns:cx2="http://schemas.microsoft.com/office/drawing/2015/10/21/chartex" xmlns:cx3="http://schemas.microsoft.com/office/drawing/2016/5/9/chartex" xmlns:cx4="http://schemas.microsoft.com/office/drawing/2016/5/10/chartex" xmlns:cx5="http://schemas.microsoft.com/office/drawing/2016/5/11/chartex" xmlns:cx6="http://schemas.microsoft.com/office/drawing/2016/5/12/chartex" xmlns:cx7="http://schemas.microsoft.com/office/drawing/2016/5/13/chartex" xmlns:cx8="http://schemas.microsoft.com/office/drawing/2016/5/14/chartex" xmlns:mc="http://schemas.openxmlformats.org/markup-compatibility/2006" xmlns:aink="http://schemas.microsoft.com/office/drawing/2016/ink" xmlns:am3d="http://schemas.microsoft.com/office/drawing/2017/model3d" xmlns:o="urn:schemas-microsoft-com:office:office" xmlns:oel="http://schemas.microsoft.com/office/2019/extlst" xmlns:r="http://schemas.openxmlformats.org/officeDocument/2006/relationships" xmlns:m="http://schemas.openxmlformats.org/officeDocument/2006/math" xmlns:v="urn:schemas-microsoft-com:vml" xmlns:wp14="http://schemas.microsoft.com/office/word/2010/wordprocessingDrawing" xmlns:wp="http://schemas.openxmlformats.org/drawingml/2006/wordprocessingDrawing" xmlns:w10="urn:schemas-microsoft-com:office:word" xmlns:w="http://schemas.openxmlformats.org/wordprocessingml/2006/main" xmlns:w14="http://schemas.microsoft.com/office/word/2010/wordml" xmlns:w15="http://schemas.microsoft.com/office/word/2012/wordml" xmlns:w16cex="http://schemas.microsoft.com/office/word/2018/wordml/cex" xmlns:w16cid="http://schemas.microsoft.com/office/word/2016/wordml/cid" xmlns:w16="http://schemas.microsoft.com/office/word/2018/wordml" xmlns:w16du="http://schemas.microsoft.com/office/word/2023/wordml/word16du" xmlns:w16sdtdh="http://schemas.microsoft.com/office/word/2020/wordml/sdtdatahash" xmlns:w16sdtfl="http://schemas.microsoft.com/office/word/2024/wordml/sdtformatlock" xmlns:w16se="http://schemas.microsoft.com/office/word/2015/wordml/symex" xmlns:wpg="http://schemas.microsoft.com/office/word/2010/wordprocessingGroup" xmlns:wpi="http://schemas.microsoft.com/office/word/2010/wordprocessingInk" xmlns:wne="http://schemas.microsoft.com/office/word/2006/wordml" xmlns:wps="http://schemas.microsoft.com/office/word/2010/wordprocessingShape" mc:Ignorable="w14 w15 w16se w16cid w16 w16cex w16sdtdh w16sdtfl w16du wp14">
   <w:body>
     <w:p>
       <w:pPr>
@@ -32,6 +32,9 @@
     </w:p>
     <w:p>
       <w:r>
+        <w:rPr>
+          <w:b/>
+        </w:rPr>
         <w:t>Team Name:</w:t>
       </w:r>
       <w:r>
@@ -40,6 +43,9 @@
     </w:p>
     <w:p>
       <w:r>
+        <w:rPr>
+          <w:b/>
+        </w:rPr>
         <w:t>Project / Product Name:</w:t>
       </w:r>
       <w:r>
@@ -48,7 +54,10 @@
     </w:p>
     <w:p>
       <w:r>
-        <w:t>Organization / Institution (if any):</w:t>
+        <w:rPr>
+          <w:b/>
+        </w:rPr>
+        <w:t>Organization / Institution:</w:t>
       </w:r>
       <w:r>
         <w:t xml:space="preserve"> Thapar Institute of Engineering and Technology, Patiala</w:t>
@@ -56,6 +65,9 @@
     </w:p>
     <w:p>
       <w:r>
+        <w:rPr>
+          <w:b/>
+        </w:rPr>
         <w:t>Submission Date:</w:t>
       </w:r>
       <w:r>
@@ -77,25 +89,24 @@
     </w:p>
     <w:p>
       <w:r>
-        <w:t>Did your team use</w:t>
+        <w:rPr>
+          <w:b/>
+        </w:rPr>
+        <w:t>Did your team use any Artificial Intelligence (AI) in developing this project?</w:t>
       </w:r>
       <w:r>
-        <w:t xml:space="preserve"> any</w:t>
-      </w:r>
-      <w:r>
-        <w:t xml:space="preserve"> Artificial Intelligence (AI) in developing this project?</w:t>
-      </w:r>
-      <w:r>
-        <w:t xml:space="preserve">  </w:t>
-      </w:r>
-      <w:r>
-        <w:t>Yes</w:t>
+        <w:t xml:space="preserve"> Yes</w:t>
       </w:r>
     </w:p>
     <w:p>
-      <w:r/>
       <w:r>
-        <w:t>Yes. Claude Code (Anthropic), used together with the team member as an equal contribution.</w:t>
+        <w:rPr>
+          <w:b/>
+        </w:rPr>
+        <w:t>Tools used:</w:t>
+      </w:r>
+      <w:r>
+        <w:t xml:space="preserve"> Claude Code (Anthropic) as a coding and writing assistant under the team member's direction; ChatGPT image generation (OpenAI) for the cover photograph.</w:t>
       </w:r>
     </w:p>
     <w:p/>
@@ -150,64 +161,80 @@
     </w:p>
     <w:p>
       <w:r>
-        <w:t xml:space="preserve">Idea generation / </w:t>
-      </w:r>
-      <w:proofErr w:type="gramStart"/>
-      <w:r>
-        <w:t>brainstorming</w:t>
+        <w:rPr>
+          <w:b/>
+        </w:rPr>
+        <w:t>Idea generation / brainstorming:</w:t>
       </w:r>
       <w:r>
-        <w:t xml:space="preserve"> Yes - ideas were discussed together with Claude Code (Anthropic); final choices made by the team member.</w:t>
-      </w:r>
-      <w:proofErr w:type="gramEnd"/>
-      <w:r/>
-    </w:p>
-    <w:p>
-      <w:r>
-        <w:t>Code generation or assistance</w:t>
-      </w:r>
-      <w:r>
-        <w:t xml:space="preserve"> Yes - code was written together with Claude Code; equal contribution with the team member.</w:t>
+        <w:t xml:space="preserve"> Done by the team member. The choice of Theme 02, the problem framing and every final design decision were made by the team member; Claude Code (Anthropic) was used as a sounding board to discuss options.</w:t>
       </w:r>
     </w:p>
     <w:p>
       <w:r>
-        <w:t>UI / UX design</w:t>
+        <w:rPr>
+          <w:b/>
+        </w:rPr>
+        <w:t>Code generation or assistance:</w:t>
       </w:r>
       <w:r>
-        <w:t xml:space="preserve"> Yes - demo page built together with Claude Code.</w:t>
+        <w:t xml:space="preserve"> Yes, assisted. The code was written with Claude Code (Anthropic) as a coding assistant, working under the team member's direction. The team member set the requirements, reviewed and tested the changes, and decided what was kept.</w:t>
       </w:r>
     </w:p>
     <w:p>
       <w:r>
-        <w:t>Content creation</w:t>
+        <w:rPr>
+          <w:b/>
+        </w:rPr>
+        <w:t>UI / UX design:</w:t>
       </w:r>
       <w:r>
-        <w:t xml:space="preserve"> Yes - README, docs and slides drafted together with Claude Code and reviewed by the team member.</w:t>
+        <w:t xml:space="preserve"> Design direction, visual style and all review feedback by the team member; the page was implemented with Claude Code's help.</w:t>
       </w:r>
     </w:p>
     <w:p>
       <w:r>
-        <w:t>Data analysis</w:t>
+        <w:rPr>
+          <w:b/>
+        </w:rPr>
+        <w:t>Content creation:</w:t>
       </w:r>
       <w:r>
-        <w:t xml:space="preserve"> Yes - analysis of the provided data files done together with Claude Code.</w:t>
+        <w:t xml:space="preserve"> README, documentation and slides were drafted with Claude Code's help and revised by the team member. The cover photograph was generated with ChatGPT image generation (OpenAI) and the real product screenshot was placed on its phone. The demo video was recorded and narrated entirely by the team member.</w:t>
       </w:r>
     </w:p>
     <w:p>
       <w:r>
-        <w:t>Testing / debugging</w:t>
+        <w:rPr>
+          <w:b/>
+        </w:rPr>
+        <w:t>Data analysis:</w:t>
       </w:r>
       <w:r>
-        <w:t xml:space="preserve"> Yes - tests and debugging done together with Claude Code.</w:t>
+        <w:t xml:space="preserve"> The provided data files were audited with Claude Code's help; the team member reviewed and approved the findings.</w:t>
       </w:r>
     </w:p>
     <w:p>
       <w:r>
-        <w:t>Other</w:t>
+        <w:rPr>
+          <w:b/>
+        </w:rPr>
+        <w:t>Testing / debugging:</w:t>
       </w:r>
       <w:r>
-        <w:t xml:space="preserve"> The product calls Groq openai/gpt-oss-120b at runtime (query enrichment and plan structuring).</w:t>
+        <w:t xml:space="preserve"> Assisted by Claude Code. The team member ran the system, tested the demo and reported the issues that were fixed.</w:t>
+      </w:r>
+    </w:p>
+    <w:p>
+      <w:r>
+        <w:rPr>
+          <w:b/>
+        </w:rPr>
+        <w:lastRenderedPageBreak/>
+        <w:t>Other (AI inside the product):</w:t>
+      </w:r>
+      <w:r>
+        <w:t xml:space="preserve"> At runtime the product calls Groq openai/gpt-oss-120b (with openai/gpt-oss-20b as an automatic fallback) for query enrichment and plan structuring. Troubleshooting steps themselves are never written by the model.</w:t>
       </w:r>
     </w:p>
     <w:p/>
@@ -248,86 +275,175 @@
     </w:p>
     <w:p>
       <w:r>
-        <w:t>1. Feature Name Grounded step extraction and relevance gate</w:t>
+        <w:rPr>
+          <w:b/>
+        </w:rPr>
+        <w:t>Feature 1 - Feature Name:</w:t>
+      </w:r>
+      <w:r>
+        <w:t xml:space="preserve"> Theme selection, requirements and final design decisions</w:t>
       </w:r>
     </w:p>
     <w:p>
       <w:r>
-        <w:t>2.  Self-Generated/AI-Generated/Both Both</w:t>
+        <w:rPr>
+          <w:b/>
+        </w:rPr>
+        <w:t>Self-Generated / AI-Generated / Both:</w:t>
+      </w:r>
+      <w:r>
+        <w:t xml:space="preserve"> Self-Generated</w:t>
       </w:r>
     </w:p>
     <w:p>
       <w:r>
-        <w:t>3. Description ( include  AI tools/platform Used, prompt used , Output Summary, Modification) Claude Code (Anthropic), used together with the team member (equal contribution). Output: taptrace/siis.py. Reviewed and corrected by the team member against the 20 provided scenarios.</w:t>
+        <w:rPr>
+          <w:b/>
+        </w:rPr>
+        <w:t>Description (AI tools used, prompts, output summary, modification):</w:t>
       </w:r>
-      <w:proofErr w:type="gramStart"/>
-      <w:r/>
-      <w:proofErr w:type="gramEnd"/>
-      <w:r/>
+      <w:r>
+        <w:t xml:space="preserve"> Done entirely by the team member: chose Theme 02, set the requirements and quality bar, and made or approved every design decision (for example which provided scenarios should return no_match). No AI tool was used for these decisions.</w:t>
+      </w:r>
     </w:p>
     <w:p/>
     <w:p>
       <w:r>
-        <w:t>1. Feature Name Deeplink catalog compiler and resolver</w:t>
+        <w:rPr>
+          <w:b/>
+        </w:rPr>
+        <w:t>Feature 2 - Feature Name:</w:t>
+      </w:r>
+      <w:r>
+        <w:t xml:space="preserve"> GitHub repository, deployment and demo video</w:t>
       </w:r>
     </w:p>
     <w:p>
       <w:r>
-        <w:t>2.  Self-Generated/AI-Generated/Both Both</w:t>
+        <w:rPr>
+          <w:b/>
+        </w:rPr>
+        <w:t>Self-Generated / AI-Generated / Both:</w:t>
+      </w:r>
+      <w:r>
+        <w:t xml:space="preserve"> Self-Generated</w:t>
       </w:r>
     </w:p>
     <w:p>
       <w:r>
-        <w:t>3. Description (include  AI tools/platform Used, prompt used , Output Summary, Modification) Claude Code, used together with the team member (equal contribution). Output: taptrace/catalog.py, resolver.py; checked with a 37-case benchmark.</w:t>
+        <w:rPr>
+          <w:b/>
+        </w:rPr>
+        <w:t>Description (AI tools used, prompts, output summary, modification):</w:t>
       </w:r>
-      <w:r/>
-      <w:proofErr w:type="gramStart"/>
-      <w:r/>
-      <w:r/>
-      <w:proofErr w:type="gramEnd"/>
-      <w:r/>
+      <w:r>
+        <w:t xml:space="preserve"> Done entirely by the team member: created and managed the GitHub repository (commits, release tag), deployed the service on Render (https://taptrace.onrender.com/), and recorded and narrated the demo video.</w:t>
+      </w:r>
     </w:p>
+    <w:p/>
     <w:p>
       <w:r>
-        <w:t>1. Feature Name Semantic cache</w:t>
+        <w:rPr>
+          <w:b/>
+        </w:rPr>
+        <w:t>Feature 3 - Feature Name:</w:t>
+      </w:r>
+      <w:r>
+        <w:t xml:space="preserve"> Troubleshooting engine (grounded step extraction, relevance gate, deeplink resolver, semantic cache)</w:t>
       </w:r>
     </w:p>
     <w:p>
       <w:r>
-        <w:t>2.  Self-Generated/AI-Generated/Both Both</w:t>
+        <w:rPr>
+          <w:b/>
+        </w:rPr>
+        <w:t>Self-Generated / AI-Generated / Both:</w:t>
+      </w:r>
+      <w:r>
+        <w:t xml:space="preserve"> Both</w:t>
       </w:r>
     </w:p>
     <w:p>
       <w:r>
-        <w:t>3. Description ( include  AI tools/platform Used, prompt used , Output Summary, Modification) Claude Code, used together with the team member (equal contribution). Output: taptrace/cache.py.</w:t>
+        <w:rPr>
+          <w:b/>
+        </w:rPr>
+        <w:t>Description (AI tools used, prompts, output summary, modification):</w:t>
       </w:r>
-      <w:proofErr w:type="gramStart"/>
-      <w:r/>
-      <w:proofErr w:type="gramEnd"/>
-      <w:r/>
+      <w:r>
+        <w:t xml:space="preserve"> Tool: Claude Code (Anthropic), as a coding assistant. Prompts: the team member's requirements taken from the Theme 02 PDF, plus bug reports and fixes. Output: the taptrace/ package. Modification: reviewed and tested by the team member against the 20 provided scenarios and a 37-case deeplink benchmark; defects the team member found were fixed.</w:t>
+      </w:r>
     </w:p>
+    <w:p/>
     <w:p>
       <w:r>
-        <w:t>1. Feature Name API, Docker, demo, tests, evaluation, documentation and slides</w:t>
+        <w:rPr>
+          <w:b/>
+        </w:rPr>
+        <w:t>Feature 4 - Feature Name:</w:t>
+      </w:r>
+      <w:r>
+        <w:t xml:space="preserve"> REST API, Docker setup, demo page, tests and evaluation scripts</w:t>
       </w:r>
     </w:p>
     <w:p>
       <w:r>
-        <w:t>2.  Self-Generated/AI-Generated/Both Both</w:t>
+        <w:rPr>
+          <w:b/>
+        </w:rPr>
+        <w:t>Self-Generated / AI-Generated / Both:</w:t>
+      </w:r>
+      <w:r>
+        <w:t xml:space="preserve"> Both</w:t>
       </w:r>
     </w:p>
     <w:p>
       <w:r>
-        <w:t>3. Description ( include  AI tools/platform Used, prompt used , Output Summary, Modification) Claude Code, used together with the team member (equal contribution). Results are produced by the evaluation scripts.</w:t>
+        <w:rPr>
+          <w:b/>
+        </w:rPr>
+        <w:t>Description (AI tools used, prompts, output summary, modification):</w:t>
       </w:r>
-      <w:proofErr w:type="gramStart"/>
-      <w:r/>
-      <w:proofErr w:type="gramEnd"/>
-      <w:r/>
+      <w:r>
+        <w:t xml:space="preserve"> Tool: Claude Code, as a coding assistant. Output: taptrace/api.py, Dockerfile, demo/index.html, tests/ and </w:t>
+      </w:r>
+      <w:r>
+        <w:lastRenderedPageBreak/>
+        <w:t>scripts/. Modification: the team member tested the demo, gave the design feedback and approved the final version.</w:t>
+      </w:r>
+    </w:p>
+    <w:p/>
+    <w:p>
+      <w:r>
+        <w:rPr>
+          <w:b/>
+        </w:rPr>
+        <w:t>Feature 5 - Feature Name:</w:t>
+      </w:r>
+      <w:r>
+        <w:t xml:space="preserve"> Presentation and documentation</w:t>
+      </w:r>
     </w:p>
     <w:p>
       <w:r>
-        <w:t>…</w:t>
+        <w:rPr>
+          <w:b/>
+        </w:rPr>
+        <w:t>Self-Generated / AI-Generated / Both:</w:t>
+      </w:r>
+      <w:r>
+        <w:t xml:space="preserve"> Both</w:t>
+      </w:r>
+    </w:p>
+    <w:p>
+      <w:r>
+        <w:rPr>
+          <w:b/>
+        </w:rPr>
+        <w:t>Description (AI tools used, prompts, output summary, modification):</w:t>
+      </w:r>
+      <w:r>
+        <w:t xml:space="preserve"> Tools: Claude Code for drafting, ChatGPT image generation for the cover photograph. Modification: structure, visual direction and final review by the team member. All numbers come from the evaluation scripts, not typed by hand.</w:t>
       </w:r>
     </w:p>
     <w:p/>
@@ -348,39 +464,24 @@
     </w:p>
     <w:p>
       <w:r>
-        <w:t>AI usage complies with guidelines and policies.</w:t>
+        <w:rPr>
+          <w:b/>
+        </w:rPr>
+        <w:t>AI usage complies with guidelines and policies:</w:t>
       </w:r>
       <w:r>
-        <w:t xml:space="preserve">  </w:t>
-      </w:r>
-      <w:r>
-        <w:rPr>
-          <w:b/>
-          <w:bCs/>
-        </w:rPr>
-        <w:t>Yes</w:t>
+        <w:t xml:space="preserve"> Yes</w:t>
       </w:r>
     </w:p>
     <w:p>
       <w:r>
-        <w:t>No proprietary or copyrighted data misused.</w:t>
+        <w:rPr>
+          <w:b/>
+        </w:rPr>
+        <w:t>No proprietary or copyrighted data misused:</w:t>
       </w:r>
       <w:r>
-        <w:t xml:space="preserve"> </w:t>
-      </w:r>
-      <w:r>
-        <w:rPr>
-          <w:b/>
-          <w:bCs/>
-        </w:rPr>
-        <w:t xml:space="preserve">I </w:t>
-      </w:r>
-      <w:r>
-        <w:rPr>
-          <w:b/>
-          <w:bCs/>
-        </w:rPr>
-        <w:t>Agree</w:t>
+        <w:t xml:space="preserve"> I Agree</w:t>
       </w:r>
     </w:p>
     <w:p/>
@@ -407,6 +508,9 @@
     </w:p>
     <w:p>
       <w:r>
+        <w:rPr>
+          <w:b/>
+        </w:rPr>
         <w:t>Name of Team Representative:</w:t>
       </w:r>
       <w:r>
@@ -415,6 +519,9 @@
     </w:p>
     <w:p>
       <w:r>
+        <w:rPr>
+          <w:b/>
+        </w:rPr>
         <w:t>Role:</w:t>
       </w:r>
       <w:r>
@@ -423,11 +530,23 @@
     </w:p>
     <w:p>
       <w:r>
+        <w:rPr>
+          <w:b/>
+        </w:rPr>
         <w:t>Signature:</w:t>
+      </w:r>
+      <w:r>
+        <w:rPr>
+          <w:b/>
+        </w:rPr>
+        <w:t xml:space="preserve"> Arnav Joshi</w:t>
       </w:r>
     </w:p>
     <w:p>
       <w:r>
+        <w:rPr>
+          <w:b/>
+        </w:rPr>
         <w:t>Date:</w:t>
       </w:r>
       <w:r>
@@ -446,7 +565,7 @@
 </file>
 
 <file path=word/numbering.xml><?xml version="1.0" encoding="utf-8"?>
-<w:numbering xmlns:wpc="http://schemas.microsoft.com/office/word/2010/wordprocessingCanvas" xmlns:cx="http://schemas.microsoft.com/office/drawing/2014/chartex" xmlns:cx1="http://schemas.microsoft.com/office/drawing/2015/9/8/chartex" xmlns:cx2="http://schemas.microsoft.com/office/drawing/2015/10/21/chartex" xmlns:cx3="http://schemas.microsoft.com/office/drawing/2016/5/9/chartex" xmlns:cx4="http://schemas.microsoft.com/office/drawing/2016/5/10/chartex" xmlns:cx5="http://schemas.microsoft.com/office/drawing/2016/5/11/chartex" xmlns:cx6="http://schemas.microsoft.com/office/drawing/2016/5/12/chartex" xmlns:cx7="http://schemas.microsoft.com/office/drawing/2016/5/13/chartex" xmlns:cx8="http://schemas.microsoft.com/office/drawing/2016/5/14/chartex" xmlns:mc="http://schemas.openxmlformats.org/markup-compatibility/2006" xmlns:aink="http://schemas.microsoft.com/office/drawing/2016/ink" xmlns:am3d="http://schemas.microsoft.com/office/drawing/2017/model3d" xmlns:o="urn:schemas-microsoft-com:office:office" xmlns:r="http://schemas.openxmlformats.org/officeDocument/2006/relationships" xmlns:m="http://schemas.openxmlformats.org/officeDocument/2006/math" xmlns:v="urn:schemas-microsoft-com:vml" xmlns:wp14="http://schemas.microsoft.com/office/word/2010/wordprocessingDrawing" xmlns:wp="http://schemas.openxmlformats.org/drawingml/2006/wordprocessingDrawing" xmlns:w10="urn:schemas-microsoft-com:office:word" xmlns:w="http://schemas.openxmlformats.org/wordprocessingml/2006/main" xmlns:w14="http://schemas.microsoft.com/office/word/2010/wordml" xmlns:w15="http://schemas.microsoft.com/office/word/2012/wordml" xmlns:w16cex="http://schemas.microsoft.com/office/word/2018/wordml/cex" xmlns:w16cid="http://schemas.microsoft.com/office/word/2016/wordml/cid" xmlns:w16="http://schemas.microsoft.com/office/word/2018/wordml" xmlns:w16sdtdh="http://schemas.microsoft.com/office/word/2020/wordml/sdtdatahash" xmlns:w16se="http://schemas.microsoft.com/office/word/2015/wordml/symex" xmlns:wpg="http://schemas.microsoft.com/office/word/2010/wordprocessingGroup" xmlns:wpi="http://schemas.microsoft.com/office/word/2010/wordprocessingInk" xmlns:wne="http://schemas.microsoft.com/office/word/2006/wordml" xmlns:wps="http://schemas.microsoft.com/office/word/2010/wordprocessingShape" mc:Ignorable="w14 w15 w16se w16cid w16 w16cex w16sdtdh wp14">
+<w:numbering xmlns:wpc="http://schemas.microsoft.com/office/word/2010/wordprocessingCanvas" xmlns:cx="http://schemas.microsoft.com/office/drawing/2014/chartex" xmlns:cx1="http://schemas.microsoft.com/office/drawing/2015/9/8/chartex" xmlns:cx2="http://schemas.microsoft.com/office/drawing/2015/10/21/chartex" xmlns:cx3="http://schemas.microsoft.com/office/drawing/2016/5/9/chartex" xmlns:cx4="http://schemas.microsoft.com/office/drawing/2016/5/10/chartex" xmlns:cx5="http://schemas.microsoft.com/office/drawing/2016/5/11/chartex" xmlns:cx6="http://schemas.microsoft.com/office/drawing/2016/5/12/chartex" xmlns:cx7="http://schemas.microsoft.com/office/drawing/2016/5/13/chartex" xmlns:cx8="http://schemas.microsoft.com/office/drawing/2016/5/14/chartex" xmlns:mc="http://schemas.openxmlformats.org/markup-compatibility/2006" xmlns:aink="http://schemas.microsoft.com/office/drawing/2016/ink" xmlns:am3d="http://schemas.microsoft.com/office/drawing/2017/model3d" xmlns:o="urn:schemas-microsoft-com:office:office" xmlns:oel="http://schemas.microsoft.com/office/2019/extlst" xmlns:r="http://schemas.openxmlformats.org/officeDocument/2006/relationships" xmlns:m="http://schemas.openxmlformats.org/officeDocument/2006/math" xmlns:v="urn:schemas-microsoft-com:vml" xmlns:wp14="http://schemas.microsoft.com/office/word/2010/wordprocessingDrawing" xmlns:wp="http://schemas.openxmlformats.org/drawingml/2006/wordprocessingDrawing" xmlns:w10="urn:schemas-microsoft-com:office:word" xmlns:w="http://schemas.openxmlformats.org/wordprocessingml/2006/main" xmlns:w14="http://schemas.microsoft.com/office/word/2010/wordml" xmlns:w15="http://schemas.microsoft.com/office/word/2012/wordml" xmlns:w16cex="http://schemas.microsoft.com/office/word/2018/wordml/cex" xmlns:w16cid="http://schemas.microsoft.com/office/word/2016/wordml/cid" xmlns:w16="http://schemas.microsoft.com/office/word/2018/wordml" xmlns:w16du="http://schemas.microsoft.com/office/word/2023/wordml/word16du" xmlns:w16sdtdh="http://schemas.microsoft.com/office/word/2020/wordml/sdtdatahash" xmlns:w16sdtfl="http://schemas.microsoft.com/office/word/2024/wordml/sdtformatlock" xmlns:w16se="http://schemas.microsoft.com/office/word/2015/wordml/symex" xmlns:wpg="http://schemas.microsoft.com/office/word/2010/wordprocessingGroup" xmlns:wpi="http://schemas.microsoft.com/office/word/2010/wordprocessingInk" xmlns:wne="http://schemas.microsoft.com/office/word/2006/wordml" xmlns:wps="http://schemas.microsoft.com/office/word/2010/wordprocessingShape" mc:Ignorable="w14 w15 w16se w16cid w16 w16cex w16sdtdh w16sdtfl w16du wp14">
   <w:abstractNum w:abstractNumId="0" w15:restartNumberingAfterBreak="0">
     <w:nsid w:val="FFFFFF7C"/>
     <w:multiLevelType w:val="singleLevel"/>
@@ -618,38 +737,38 @@
       </w:rPr>
     </w:lvl>
   </w:abstractNum>
-  <w:num w:numId="1">
+  <w:num w:numId="1" w16cid:durableId="839079132">
     <w:abstractNumId w:val="8"/>
   </w:num>
-  <w:num w:numId="2">
+  <w:num w:numId="2" w16cid:durableId="818570342">
     <w:abstractNumId w:val="6"/>
   </w:num>
-  <w:num w:numId="3">
+  <w:num w:numId="3" w16cid:durableId="412508210">
     <w:abstractNumId w:val="5"/>
   </w:num>
-  <w:num w:numId="4">
+  <w:num w:numId="4" w16cid:durableId="1436440881">
     <w:abstractNumId w:val="4"/>
   </w:num>
-  <w:num w:numId="5">
+  <w:num w:numId="5" w16cid:durableId="254485847">
     <w:abstractNumId w:val="7"/>
   </w:num>
-  <w:num w:numId="6">
+  <w:num w:numId="6" w16cid:durableId="232274791">
     <w:abstractNumId w:val="3"/>
   </w:num>
-  <w:num w:numId="7">
+  <w:num w:numId="7" w16cid:durableId="599997197">
     <w:abstractNumId w:val="2"/>
   </w:num>
-  <w:num w:numId="8">
+  <w:num w:numId="8" w16cid:durableId="1937900965">
     <w:abstractNumId w:val="1"/>
   </w:num>
-  <w:num w:numId="9">
+  <w:num w:numId="9" w16cid:durableId="1232933204">
     <w:abstractNumId w:val="0"/>
   </w:num>
 </w:numbering>
 </file>
 
 <file path=word/styles.xml><?xml version="1.0" encoding="utf-8"?>
-<w:styles xmlns:mc="http://schemas.openxmlformats.org/markup-compatibility/2006" xmlns:r="http://schemas.openxmlformats.org/officeDocument/2006/relationships" xmlns:w="http://schemas.openxmlformats.org/wordprocessingml/2006/main" xmlns:w14="http://schemas.microsoft.com/office/word/2010/wordml" xmlns:w15="http://schemas.microsoft.com/office/word/2012/wordml" xmlns:w16cex="http://schemas.microsoft.com/office/word/2018/wordml/cex" xmlns:w16cid="http://schemas.microsoft.com/office/word/2016/wordml/cid" xmlns:w16="http://schemas.microsoft.com/office/word/2018/wordml" xmlns:w16sdtdh="http://schemas.microsoft.com/office/word/2020/wordml/sdtdatahash" xmlns:w16se="http://schemas.microsoft.com/office/word/2015/wordml/symex" mc:Ignorable="w14 w15 w16se w16cid w16 w16cex w16sdtdh">
+<w:styles xmlns:mc="http://schemas.openxmlformats.org/markup-compatibility/2006" xmlns:r="http://schemas.openxmlformats.org/officeDocument/2006/relationships" xmlns:w="http://schemas.openxmlformats.org/wordprocessingml/2006/main" xmlns:w14="http://schemas.microsoft.com/office/word/2010/wordml" xmlns:w15="http://schemas.microsoft.com/office/word/2012/wordml" xmlns:w16cex="http://schemas.microsoft.com/office/word/2018/wordml/cex" xmlns:w16cid="http://schemas.microsoft.com/office/word/2016/wordml/cid" xmlns:w16="http://schemas.microsoft.com/office/word/2018/wordml" xmlns:w16du="http://schemas.microsoft.com/office/word/2023/wordml/word16du" xmlns:w16sdtdh="http://schemas.microsoft.com/office/word/2020/wordml/sdtdatahash" xmlns:w16sdtfl="http://schemas.microsoft.com/office/word/2024/wordml/sdtformatlock" xmlns:w16se="http://schemas.microsoft.com/office/word/2015/wordml/symex" mc:Ignorable="w14 w15 w16se w16cid w16 w16cex w16sdtdh w16sdtfl w16du">
   <w:docDefaults>
     <w:rPrDefault>
       <w:rPr>

</xml_diff>